<commit_message>
Add cleanup usage snapshot and daily reports
</commit_message>
<xml_diff>
--- a/2026CIP_王冠婷_雙週工作週誌1_格式正確版.docx
+++ b/2026CIP_王冠婷_雙週工作週誌1_格式正確版.docx
@@ -1,6 +1,6 @@
 
 <file path=word/document.xml><?xml version="1.0" encoding="utf-8"?>
-<w:document xmlns:wpc="http://schemas.microsoft.com/office/word/2010/wordprocessingCanvas" xmlns:cx="http://schemas.microsoft.com/office/drawing/2014/chartex" xmlns:cx1="http://schemas.microsoft.com/office/drawing/2015/9/8/chartex" xmlns:cx2="http://schemas.microsoft.com/office/drawing/2015/10/21/chartex" xmlns:cx3="http://schemas.microsoft.com/office/drawing/2016/5/9/chartex" xmlns:cx4="http://schemas.microsoft.com/office/drawing/2016/5/10/chartex" xmlns:cx5="http://schemas.microsoft.com/office/drawing/2016/5/11/chartex" xmlns:cx6="http://schemas.microsoft.com/office/drawing/2016/5/12/chartex" xmlns:cx7="http://schemas.microsoft.com/office/drawing/2016/5/13/chartex" xmlns:cx8="http://schemas.microsoft.com/office/drawing/2016/5/14/chartex" xmlns:mc="http://schemas.openxmlformats.org/markup-compatibility/2006" xmlns:aink="http://schemas.microsoft.com/office/drawing/2016/ink" xmlns:am3d="http://schemas.microsoft.com/office/drawing/2017/model3d" xmlns:o="urn:schemas-microsoft-com:office:office" xmlns:oel="http://schemas.microsoft.com/office/2019/extlst" xmlns:r="http://schemas.openxmlformats.org/officeDocument/2006/relationships" xmlns:m="http://schemas.openxmlformats.org/officeDocument/2006/math" xmlns:v="urn:schemas-microsoft-com:vml" xmlns:wp14="http://schemas.microsoft.com/office/word/2010/wordprocessingDrawing" xmlns:wp="http://schemas.openxmlformats.org/drawingml/2006/wordprocessingDrawing" xmlns:w10="urn:schemas-microsoft-com:office:word" xmlns:w="http://schemas.openxmlformats.org/wordprocessingml/2006/main" xmlns:w14="http://schemas.microsoft.com/office/word/2010/wordml" xmlns:w15="http://schemas.microsoft.com/office/word/2012/wordml" xmlns:w16cex="http://schemas.microsoft.com/office/word/2018/wordml/cex" xmlns:w16cid="http://schemas.microsoft.com/office/word/2016/wordml/cid" xmlns:w16="http://schemas.microsoft.com/office/word/2018/wordml" xmlns:w16du="http://schemas.microsoft.com/office/word/2023/wordml/word16du" xmlns:w16sdtdh="http://schemas.microsoft.com/office/word/2020/wordml/sdtdatahash" xmlns:w16sdtfl="http://schemas.microsoft.com/office/word/2024/wordml/sdtformatlock" xmlns:w16se="http://schemas.microsoft.com/office/word/2015/wordml/symex" xmlns:wpg="http://schemas.microsoft.com/office/word/2010/wordprocessingGroup" xmlns:wpi="http://schemas.microsoft.com/office/word/2010/wordprocessingInk" xmlns:wne="http://schemas.microsoft.com/office/word/2006/wordml" xmlns:wps="http://schemas.microsoft.com/office/word/2010/wordprocessingShape" mc:Ignorable="w14 w15 w16se w16cid w16 w16cex w16sdtdh w16sdtfl w16du wp14">
+<w:document xmlns:wpc="http://schemas.microsoft.com/office/word/2010/wordprocessingCanvas" xmlns:cx="http://schemas.microsoft.com/office/drawing/2014/chartex" xmlns:cx1="http://schemas.microsoft.com/office/drawing/2015/9/8/chartex" xmlns:cx2="http://schemas.microsoft.com/office/drawing/2015/10/21/chartex" xmlns:cx3="http://schemas.microsoft.com/office/drawing/2016/5/9/chartex" xmlns:cx4="http://schemas.microsoft.com/office/drawing/2016/5/10/chartex" xmlns:cx5="http://schemas.microsoft.com/office/drawing/2016/5/11/chartex" xmlns:cx6="http://schemas.microsoft.com/office/drawing/2016/5/12/chartex" xmlns:cx7="http://schemas.microsoft.com/office/drawing/2016/5/13/chartex" xmlns:cx8="http://schemas.microsoft.com/office/drawing/2016/5/14/chartex" xmlns:mc="http://schemas.openxmlformats.org/markup-compatibility/2006" xmlns:aink="http://schemas.microsoft.com/office/drawing/2016/ink" xmlns:am3d="http://schemas.microsoft.com/office/drawing/2017/model3d" xmlns:o="urn:schemas-microsoft-com:office:office" xmlns:oel="http://schemas.microsoft.com/office/2019/extlst" xmlns:r="http://schemas.openxmlformats.org/officeDocument/2006/relationships" xmlns:m="http://schemas.openxmlformats.org/officeDocument/2006/math" xmlns:v="urn:schemas-microsoft-com:vml" xmlns:wp14="http://schemas.microsoft.com/office/word/2010/wordprocessingDrawing" xmlns:wp="http://schemas.openxmlformats.org/drawingml/2006/wordprocessingDrawing" xmlns:w10="urn:schemas-microsoft-com:office:word" xmlns:w="http://schemas.openxmlformats.org/wordprocessingml/2006/main" xmlns:w14="http://schemas.microsoft.com/office/word/2010/wordml" xmlns:w15="http://schemas.microsoft.com/office/word/2012/wordml" xmlns:w16cei="http://schemas.microsoft.com/office/word/2026/wordml/cei" xmlns:w16cex="http://schemas.microsoft.com/office/word/2018/wordml/cex" xmlns:w16cid="http://schemas.microsoft.com/office/word/2016/wordml/cid" xmlns:w16="http://schemas.microsoft.com/office/word/2018/wordml" xmlns:w16du="http://schemas.microsoft.com/office/word/2023/wordml/word16du" xmlns:w16sdtdh="http://schemas.microsoft.com/office/word/2020/wordml/sdtdatahash" xmlns:w16sdtfl="http://schemas.microsoft.com/office/word/2024/wordml/sdtformatlock" xmlns:w16se="http://schemas.microsoft.com/office/word/2015/wordml/symex" xmlns:wpg="http://schemas.microsoft.com/office/word/2010/wordprocessingGroup" xmlns:wpi="http://schemas.microsoft.com/office/word/2010/wordprocessingInk" xmlns:wne="http://schemas.microsoft.com/office/word/2006/wordml" xmlns:wps="http://schemas.microsoft.com/office/word/2010/wordprocessingShape" mc:Ignorable="w14 w15 w16se w16cid w16 w16cex w16sdtdh w16sdtfl w16du wp14">
   <w:body>
     <w:p>
       <w:pPr>
@@ -73,7 +73,43 @@
           <w:sz w:val="32"/>
           <w:szCs w:val="32"/>
         </w:rPr>
-        <w:t>7/8-7/17</w:t>
+        <w:t>7/</w:t>
+      </w:r>
+      <w:r>
+        <w:rPr>
+          <w:rFonts w:ascii="微軟正黑體" w:eastAsia="微軟正黑體" w:hAnsi="微軟正黑體" w:hint="eastAsia"/>
+          <w:b/>
+          <w:sz w:val="32"/>
+          <w:szCs w:val="32"/>
+        </w:rPr>
+        <w:t>20</w:t>
+      </w:r>
+      <w:r>
+        <w:rPr>
+          <w:rFonts w:ascii="微軟正黑體" w:eastAsia="微軟正黑體" w:hAnsi="微軟正黑體" w:hint="eastAsia"/>
+          <w:b/>
+          <w:sz w:val="32"/>
+          <w:szCs w:val="32"/>
+        </w:rPr>
+        <w:t>-7/</w:t>
+      </w:r>
+      <w:r>
+        <w:rPr>
+          <w:rFonts w:ascii="微軟正黑體" w:eastAsia="微軟正黑體" w:hAnsi="微軟正黑體" w:hint="eastAsia"/>
+          <w:b/>
+          <w:sz w:val="32"/>
+          <w:szCs w:val="32"/>
+        </w:rPr>
+        <w:t>3</w:t>
+      </w:r>
+      <w:r>
+        <w:rPr>
+          <w:rFonts w:ascii="微軟正黑體" w:eastAsia="微軟正黑體" w:hAnsi="微軟正黑體" w:hint="eastAsia"/>
+          <w:b/>
+          <w:sz w:val="32"/>
+          <w:szCs w:val="32"/>
+        </w:rPr>
+        <w:t>1</w:t>
       </w:r>
       <w:r>
         <w:rPr>
@@ -460,7 +496,7 @@
               <w:spacing w:line="320" w:lineRule="exact"/>
               <w:jc w:val="center"/>
               <w:rPr>
-                <w:rFonts w:ascii="微軟正黑體" w:eastAsia="微軟正黑體" w:hAnsi="微軟正黑體" w:hint="eastAsia"/>
+                <w:rFonts w:ascii="微軟正黑體" w:eastAsia="微軟正黑體" w:hAnsi="微軟正黑體"/>
                 <w:sz w:val="24"/>
                 <w:szCs w:val="24"/>
               </w:rPr>
@@ -534,10 +570,9 @@
             <w:r>
               <w:rPr>
                 <w:rFonts w:ascii="標楷體" w:hAnsi="標楷體"/>
-                <w:sz w:val="24"/>
-                <w:szCs w:val="24"/>
-              </w:rPr>
-              <w:t>AWS 技術雷達 PoC 與評估流程設計</w:t>
+                <w:sz w:val="21"/>
+              </w:rPr>
+              <w:t>AWS S3 Files 端到端 PoC、報價與 cleanup</w:t>
             </w:r>
           </w:p>
         </w:tc>
@@ -571,7 +606,7 @@
                 <w:sz w:val="24"/>
                 <w:szCs w:val="24"/>
               </w:rPr>
-              <w:t>8</w:t>
+              <w:t>27</w:t>
             </w:r>
             <w:r>
               <w:rPr>
@@ -604,7 +639,7 @@
                 <w:sz w:val="24"/>
                 <w:szCs w:val="24"/>
               </w:rPr>
-              <w:t>13</w:t>
+              <w:t>29</w:t>
             </w:r>
           </w:p>
         </w:tc>
@@ -615,6 +650,30 @@
           </w:tcPr>
           <w:p>
             <w:pPr>
+              <w:spacing w:after="40" w:line="252" w:lineRule="auto"/>
+            </w:pPr>
+            <w:r>
+              <w:rPr>
+                <w:rFonts w:ascii="標楷體" w:hAnsi="標楷體"/>
+                <w:sz w:val="21"/>
+              </w:rPr>
+              <w:t>1. 從 AWS 官方 S3 Files 文章出發，完成 S1-S5 fresh run；Skill 3 分數 4.4/5，公開證據達 PoC 審查門檻。</w:t>
+            </w:r>
+          </w:p>
+          <w:p>
+            <w:pPr>
+              <w:spacing w:after="40" w:line="252" w:lineRule="auto"/>
+            </w:pPr>
+            <w:r>
+              <w:rPr>
+                <w:rFonts w:ascii="標楷體" w:hAnsi="標楷體"/>
+                <w:sz w:val="21"/>
+              </w:rPr>
+              <w:t>2. 以 CDK synth 與 CloudFormation 建立 sandbox PoC，驗證 S3 到 mount、mount 到 S3 的雙向資料讀寫。</w:t>
+            </w:r>
+          </w:p>
+          <w:p>
+            <w:pPr>
               <w:rPr>
                 <w:rFonts w:ascii="標楷體" w:hAnsi="標楷體"/>
                 <w:sz w:val="24"/>
@@ -624,44 +683,9 @@
             <w:r>
               <w:rPr>
                 <w:rFonts w:ascii="標楷體" w:hAnsi="標楷體"/>
-                <w:sz w:val="24"/>
-                <w:szCs w:val="24"/>
-              </w:rPr>
-              <w:t>1.整理技術架構，建立掃描、比較、評估、驗證與報告流程。</w:t>
-            </w:r>
-            <w:r>
-              <w:rPr>
-                <w:rFonts w:ascii="標楷體" w:hAnsi="標楷體"/>
-                <w:sz w:val="24"/>
-                <w:szCs w:val="24"/>
-              </w:rPr>
-              <w:br/>
-              <w:t>2.在個人 AWS 帳戶完成 Step Functions pipeline 初步執行，確認報告產出流程可行。</w:t>
-            </w:r>
-            <w:r>
-              <w:rPr>
-                <w:rFonts w:ascii="標楷體" w:hAnsi="標楷體"/>
-                <w:sz w:val="24"/>
-                <w:szCs w:val="24"/>
-              </w:rPr>
-              <w:br/>
-              <w:t>3.</w:t>
-            </w:r>
-            <w:r>
-              <w:rPr>
-                <w:rFonts w:ascii="標楷體" w:hAnsi="標楷體" w:hint="eastAsia"/>
-                <w:sz w:val="24"/>
-                <w:szCs w:val="24"/>
-              </w:rPr>
-              <w:t>加</w:t>
-            </w:r>
-            <w:r>
-              <w:rPr>
-                <w:rFonts w:ascii="標楷體" w:hAnsi="標楷體"/>
-                <w:sz w:val="24"/>
-                <w:szCs w:val="24"/>
-              </w:rPr>
-              <w:t>成本檢查、部署文件與檢核點。</w:t>
+                <w:sz w:val="21"/>
+              </w:rPr>
+              <w:t>3. 補上公開牌價 PoC 報價單，低／預期／高估算為 USD 0.018037／0.047190／0.150962，並在 Console review 後完成 run-scoped cleanup。</w:t>
             </w:r>
           </w:p>
         </w:tc>
@@ -689,10 +713,9 @@
             <w:r>
               <w:rPr>
                 <w:rFonts w:ascii="標楷體" w:hAnsi="標楷體"/>
-                <w:sz w:val="24"/>
-                <w:szCs w:val="24"/>
-              </w:rPr>
-              <w:t>公司帳戶版手動部署</w:t>
+                <w:sz w:val="21"/>
+              </w:rPr>
+              <w:t>S1-S5 技術雷達流程重整與 Skill 化</w:t>
             </w:r>
           </w:p>
         </w:tc>
@@ -718,7 +741,7 @@
                 <w:sz w:val="24"/>
                 <w:szCs w:val="24"/>
               </w:rPr>
-              <w:t>7/14</w:t>
+              <w:t>7/</w:t>
             </w:r>
             <w:r>
               <w:rPr>
@@ -726,7 +749,7 @@
                 <w:sz w:val="24"/>
                 <w:szCs w:val="24"/>
               </w:rPr>
-              <w:t>~7/16</w:t>
+              <w:t>20~7/24</w:t>
             </w:r>
           </w:p>
         </w:tc>
@@ -737,28 +760,70 @@
           </w:tcPr>
           <w:p>
             <w:pPr>
-              <w:rPr>
-                <w:rFonts w:ascii="標楷體" w:hAnsi="標楷體" w:hint="eastAsia"/>
-                <w:sz w:val="24"/>
-                <w:szCs w:val="24"/>
-              </w:rPr>
+              <w:spacing w:after="40" w:line="252" w:lineRule="auto"/>
             </w:pPr>
             <w:r>
+              <w:rPr>
+                <w:rFonts w:ascii="標楷體" w:hAnsi="標楷體"/>
+                <w:sz w:val="21"/>
+              </w:rPr>
+              <w:t>1. 將</w:t>
+            </w:r>
+            <w:r>
+              <w:rPr>
+                <w:rFonts w:ascii="標楷體" w:hAnsi="標楷體" w:hint="eastAsia"/>
+                <w:sz w:val="21"/>
+              </w:rPr>
+              <w:t>探索</w:t>
+            </w:r>
+            <w:r>
+              <w:rPr>
+                <w:rFonts w:ascii="標楷體" w:hAnsi="標楷體"/>
+                <w:sz w:val="21"/>
+              </w:rPr>
+              <w:t>雷達</w:t>
+            </w:r>
+            <w:r>
+              <w:rPr>
+                <w:rFonts w:ascii="標楷體" w:hAnsi="標楷體" w:hint="eastAsia"/>
+                <w:sz w:val="21"/>
+              </w:rPr>
+              <w:t>範圍收斂至aws blog</w:t>
+            </w:r>
+            <w:r>
+              <w:rPr>
+                <w:rFonts w:ascii="標楷體" w:hAnsi="標楷體"/>
+                <w:sz w:val="21"/>
+              </w:rPr>
+              <w:t>。</w:t>
+            </w:r>
+          </w:p>
+          <w:p>
+            <w:pPr>
+              <w:spacing w:after="40" w:line="252" w:lineRule="auto"/>
+            </w:pPr>
+            <w:r>
+              <w:rPr>
+                <w:rFonts w:ascii="標楷體" w:hAnsi="標楷體"/>
+                <w:sz w:val="21"/>
+              </w:rPr>
+              <w:t>2. 將入口調整為公開 URL 匯入與官方來源探索，S2 產出可討論的提案卡，避免直接跳到 PoC。</w:t>
+            </w:r>
+          </w:p>
+          <w:p>
+            <w:pPr>
               <w:rPr>
                 <w:rFonts w:ascii="標楷體" w:hAnsi="標楷體"/>
                 <w:sz w:val="24"/>
                 <w:szCs w:val="24"/>
               </w:rPr>
-              <w:t>1. 在公司 AWS 帳戶建立 S3、DynamoDB、Secrets Manager、Lambda Layer、7 個 Lambda Functions、Step Functions role 與 state machine。</w:t>
-            </w:r>
+            </w:pPr>
             <w:r>
               <w:rPr>
                 <w:rFonts w:ascii="標楷體" w:hAnsi="標楷體"/>
-                <w:sz w:val="24"/>
-                <w:szCs w:val="24"/>
-              </w:rPr>
-              <w:br/>
-              <w:t>2. 排查並修正 S3 bucket name、Lambda S3 寫入權限、Step Functions logging 權限、Lambda handler 與 Anthropic API key 驗證錯誤。</w:t>
+                <w:sz w:val="21"/>
+              </w:rPr>
+              <w:t>3. 建立固定 rubric、人工 shortlist、PoC gate、artifact-only report 等規則，讓每一步都有可回查 JSON 證據。</w:t>
             </w:r>
           </w:p>
         </w:tc>
@@ -786,34 +851,9 @@
             <w:r>
               <w:rPr>
                 <w:rFonts w:ascii="標楷體" w:hAnsi="標楷體"/>
-                <w:sz w:val="24"/>
-                <w:szCs w:val="24"/>
-              </w:rPr>
-              <w:t>AI PM 紀錄、</w:t>
-            </w:r>
-            <w:r>
-              <w:rPr>
-                <w:rFonts w:ascii="標楷體" w:hAnsi="標楷體"/>
-                <w:sz w:val="24"/>
-                <w:szCs w:val="24"/>
-              </w:rPr>
-              <w:t>端到端</w:t>
-            </w:r>
-            <w:r>
-              <w:rPr>
-                <w:rFonts w:ascii="標楷體" w:hAnsi="標楷體" w:hint="eastAsia"/>
-                <w:sz w:val="24"/>
-                <w:szCs w:val="24"/>
-              </w:rPr>
-              <w:t>初步</w:t>
-            </w:r>
-            <w:r>
-              <w:rPr>
-                <w:rFonts w:ascii="標楷體" w:hAnsi="標楷體"/>
-                <w:sz w:val="24"/>
-                <w:szCs w:val="24"/>
-              </w:rPr>
-              <w:t>驗證</w:t>
+                <w:sz w:val="21"/>
+              </w:rPr>
+              <w:t>Lambda self-managed S3 code storage 候選驗證</w:t>
             </w:r>
           </w:p>
         </w:tc>
@@ -839,7 +879,7 @@
                 <w:sz w:val="24"/>
                 <w:szCs w:val="24"/>
               </w:rPr>
-              <w:t>7/1</w:t>
+              <w:t>7/</w:t>
             </w:r>
             <w:r>
               <w:rPr>
@@ -847,7 +887,7 @@
                 <w:sz w:val="24"/>
                 <w:szCs w:val="24"/>
               </w:rPr>
-              <w:t>7</w:t>
+              <w:t>30~7/31</w:t>
             </w:r>
           </w:p>
         </w:tc>
@@ -858,6 +898,30 @@
           </w:tcPr>
           <w:p>
             <w:pPr>
+              <w:spacing w:after="40" w:line="252" w:lineRule="auto"/>
+            </w:pPr>
+            <w:r>
+              <w:rPr>
+                <w:rFonts w:ascii="標楷體" w:hAnsi="標楷體"/>
+                <w:sz w:val="21"/>
+              </w:rPr>
+              <w:t>1. 以 AWS 官方資訊跑完 Lambda 候選的 S1-S5，完成 CloudFormation deployment、REFERENCE 設定與 Lambda invoke 自動化驗證。</w:t>
+            </w:r>
+          </w:p>
+          <w:p>
+            <w:pPr>
+              <w:spacing w:after="40" w:line="252" w:lineRule="auto"/>
+            </w:pPr>
+            <w:r>
+              <w:rPr>
+                <w:rFonts w:ascii="標楷體" w:hAnsi="標楷體"/>
+                <w:sz w:val="21"/>
+              </w:rPr>
+              <w:t>2. 將 Console review 與 cleanup 明確保留為人工關卡，未完成前不寫成結案。</w:t>
+            </w:r>
+          </w:p>
+          <w:p>
+            <w:pPr>
               <w:rPr>
                 <w:rFonts w:ascii="標楷體" w:hAnsi="標楷體"/>
                 <w:sz w:val="24"/>
@@ -867,42 +931,9 @@
             <w:r>
               <w:rPr>
                 <w:rFonts w:ascii="標楷體" w:hAnsi="標楷體"/>
-                <w:sz w:val="24"/>
-                <w:szCs w:val="24"/>
-              </w:rPr>
-              <w:t>1. 建立 AI PM 紀錄機制，使用 Git、Notion、本機日誌與 Skill 儀表板追蹤進度、驗證證據、阻塞點與下一步。</w:t>
-            </w:r>
-            <w:r>
-              <w:rPr>
-                <w:rFonts w:ascii="標楷體" w:hAnsi="標楷體"/>
-                <w:sz w:val="24"/>
-                <w:szCs w:val="24"/>
-              </w:rPr>
-              <w:br/>
-            </w:r>
-            <w:r>
-              <w:rPr>
-                <w:rFonts w:ascii="標楷體" w:hAnsi="標楷體" w:hint="eastAsia"/>
-                <w:sz w:val="24"/>
-                <w:szCs w:val="24"/>
-              </w:rPr>
-              <w:t>2.</w:t>
-            </w:r>
-            <w:r>
-              <w:rPr>
-                <w:rFonts w:ascii="標楷體" w:hAnsi="標楷體"/>
-                <w:sz w:val="24"/>
-                <w:szCs w:val="24"/>
-              </w:rPr>
-              <w:t xml:space="preserve"> </w:t>
-            </w:r>
-            <w:r>
-              <w:rPr>
-                <w:rFonts w:ascii="標楷體" w:hAnsi="標楷體"/>
-                <w:sz w:val="24"/>
-                <w:szCs w:val="24"/>
-              </w:rPr>
-              <w:t>完成公司帳戶第一次端到端成功執行，S1 Scan、S2 Compare、Quote、S3 Evaluate、S4 Validate、S5 Report 皆在 Step Functions 圖上顯示成功。</w:t>
+                <w:sz w:val="21"/>
+              </w:rPr>
+              <w:t>3. 本項目前作為第二條真實 PoC 證據鏈，仍待 Cleo 於 AWS Console 完成人工確認與 cleanup 決策。</w:t>
             </w:r>
           </w:p>
         </w:tc>
@@ -952,28 +983,11 @@
           <w:p>
             <w:pPr>
               <w:rPr>
-                <w:rFonts w:ascii="標楷體" w:hAnsi="標楷體" w:hint="eastAsia"/>
-                <w:sz w:val="24"/>
-                <w:szCs w:val="24"/>
-              </w:rPr>
-            </w:pPr>
-            <w:r>
-              <w:rPr>
                 <w:rFonts w:ascii="標楷體" w:hAnsi="標楷體"/>
                 <w:sz w:val="24"/>
                 <w:szCs w:val="24"/>
               </w:rPr>
-              <w:t>建議內容：後續若需持續在公司 AWS 帳戶部署或 demo，建議先確認 SCP、IAM role、logging 權限與資源命名規則，並保留可回溯的驗證截圖或執行紀錄。</w:t>
-            </w:r>
-            <w:r>
-              <w:rPr>
-                <w:rFonts w:ascii="標楷體" w:hAnsi="標楷體"/>
-                <w:sz w:val="24"/>
-                <w:szCs w:val="24"/>
-              </w:rPr>
-              <w:br/>
-              <w:t>心得回饋：這段期間從原型程式推進到公司帳戶端到端驗證，體會到實務交付不只要程式能跑，還需要成本控管、權限設計、降級機制、資料保存與可被主管檢查的證據鏈。</w:t>
-            </w:r>
+            </w:pPr>
           </w:p>
         </w:tc>
       </w:tr>
@@ -1023,7 +1037,10 @@
         <w:t>雙週工作週誌</w:t>
       </w:r>
       <w:r>
-        <w:t>1</w:t>
+        <w:rPr>
+          <w:rFonts w:hint="eastAsia"/>
+        </w:rPr>
+        <w:t>2</w:t>
       </w:r>
     </w:p>
     <w:p>
@@ -1085,7 +1102,31 @@
           <w:szCs w:val="24"/>
           <w:shd w:val="clear" w:color="auto" w:fill="D6E3BC" w:themeFill="accent3" w:themeFillTint="66"/>
         </w:rPr>
-        <w:t>7/17(五)前</w:t>
+        <w:t>7/</w:t>
+      </w:r>
+      <w:r>
+        <w:rPr>
+          <w:rFonts w:ascii="微軟正黑體" w:eastAsia="微軟正黑體" w:hAnsi="微軟正黑體" w:hint="eastAsia"/>
+          <w:b/>
+          <w:bCs/>
+          <w:color w:val="FF0000"/>
+          <w:sz w:val="24"/>
+          <w:szCs w:val="24"/>
+          <w:shd w:val="clear" w:color="auto" w:fill="D6E3BC" w:themeFill="accent3" w:themeFillTint="66"/>
+        </w:rPr>
+        <w:t>31</w:t>
+      </w:r>
+      <w:r>
+        <w:rPr>
+          <w:rFonts w:ascii="微軟正黑體" w:eastAsia="微軟正黑體" w:hAnsi="微軟正黑體" w:hint="eastAsia"/>
+          <w:b/>
+          <w:bCs/>
+          <w:color w:val="FF0000"/>
+          <w:sz w:val="24"/>
+          <w:szCs w:val="24"/>
+          <w:shd w:val="clear" w:color="auto" w:fill="D6E3BC" w:themeFill="accent3" w:themeFillTint="66"/>
+        </w:rPr>
+        <w:t>(五)前</w:t>
       </w:r>
       <w:r>
         <w:rPr>
@@ -1126,7 +1167,16 @@
           <w:sz w:val="24"/>
           <w:szCs w:val="24"/>
         </w:rPr>
-        <w:t>信件務必同步CC單位協理＆經理&amp;mentor</w:t>
+        <w:t>信件務必同步CC單位協理＆經理</w:t>
+      </w:r>
+      <w:r>
+        <w:rPr>
+          <w:rFonts w:ascii="微軟正黑體" w:eastAsia="微軟正黑體" w:hAnsi="微軟正黑體" w:hint="eastAsia"/>
+          <w:sz w:val="24"/>
+          <w:szCs w:val="24"/>
+        </w:rPr>
+        <w:lastRenderedPageBreak/>
+        <w:t>&amp;mentor</w:t>
       </w:r>
     </w:p>
     <w:p>
@@ -1271,7 +1321,7 @@
 </file>
 
 <file path=word/endnotes.xml><?xml version="1.0" encoding="utf-8"?>
-<w:endnotes xmlns:wpc="http://schemas.microsoft.com/office/word/2010/wordprocessingCanvas" xmlns:cx="http://schemas.microsoft.com/office/drawing/2014/chartex" xmlns:cx1="http://schemas.microsoft.com/office/drawing/2015/9/8/chartex" xmlns:cx2="http://schemas.microsoft.com/office/drawing/2015/10/21/chartex" xmlns:cx3="http://schemas.microsoft.com/office/drawing/2016/5/9/chartex" xmlns:cx4="http://schemas.microsoft.com/office/drawing/2016/5/10/chartex" xmlns:cx5="http://schemas.microsoft.com/office/drawing/2016/5/11/chartex" xmlns:cx6="http://schemas.microsoft.com/office/drawing/2016/5/12/chartex" xmlns:cx7="http://schemas.microsoft.com/office/drawing/2016/5/13/chartex" xmlns:cx8="http://schemas.microsoft.com/office/drawing/2016/5/14/chartex" xmlns:mc="http://schemas.openxmlformats.org/markup-compatibility/2006" xmlns:aink="http://schemas.microsoft.com/office/drawing/2016/ink" xmlns:am3d="http://schemas.microsoft.com/office/drawing/2017/model3d" xmlns:o="urn:schemas-microsoft-com:office:office" xmlns:oel="http://schemas.microsoft.com/office/2019/extlst" xmlns:r="http://schemas.openxmlformats.org/officeDocument/2006/relationships" xmlns:m="http://schemas.openxmlformats.org/officeDocument/2006/math" xmlns:v="urn:schemas-microsoft-com:vml" xmlns:wp14="http://schemas.microsoft.com/office/word/2010/wordprocessingDrawing" xmlns:wp="http://schemas.openxmlformats.org/drawingml/2006/wordprocessingDrawing" xmlns:w10="urn:schemas-microsoft-com:office:word" xmlns:w="http://schemas.openxmlformats.org/wordprocessingml/2006/main" xmlns:w14="http://schemas.microsoft.com/office/word/2010/wordml" xmlns:w15="http://schemas.microsoft.com/office/word/2012/wordml" xmlns:w16cex="http://schemas.microsoft.com/office/word/2018/wordml/cex" xmlns:w16cid="http://schemas.microsoft.com/office/word/2016/wordml/cid" xmlns:w16="http://schemas.microsoft.com/office/word/2018/wordml" xmlns:w16du="http://schemas.microsoft.com/office/word/2023/wordml/word16du" xmlns:w16sdtdh="http://schemas.microsoft.com/office/word/2020/wordml/sdtdatahash" xmlns:w16sdtfl="http://schemas.microsoft.com/office/word/2024/wordml/sdtformatlock" xmlns:w16se="http://schemas.microsoft.com/office/word/2015/wordml/symex" xmlns:wpg="http://schemas.microsoft.com/office/word/2010/wordprocessingGroup" xmlns:wpi="http://schemas.microsoft.com/office/word/2010/wordprocessingInk" xmlns:wne="http://schemas.microsoft.com/office/word/2006/wordml" xmlns:wps="http://schemas.microsoft.com/office/word/2010/wordprocessingShape" mc:Ignorable="w14 w15 w16se w16cid w16 w16cex w16sdtdh w16sdtfl w16du wp14">
+<w:endnotes xmlns:wpc="http://schemas.microsoft.com/office/word/2010/wordprocessingCanvas" xmlns:cx="http://schemas.microsoft.com/office/drawing/2014/chartex" xmlns:cx1="http://schemas.microsoft.com/office/drawing/2015/9/8/chartex" xmlns:cx2="http://schemas.microsoft.com/office/drawing/2015/10/21/chartex" xmlns:cx3="http://schemas.microsoft.com/office/drawing/2016/5/9/chartex" xmlns:cx4="http://schemas.microsoft.com/office/drawing/2016/5/10/chartex" xmlns:cx5="http://schemas.microsoft.com/office/drawing/2016/5/11/chartex" xmlns:cx6="http://schemas.microsoft.com/office/drawing/2016/5/12/chartex" xmlns:cx7="http://schemas.microsoft.com/office/drawing/2016/5/13/chartex" xmlns:cx8="http://schemas.microsoft.com/office/drawing/2016/5/14/chartex" xmlns:mc="http://schemas.openxmlformats.org/markup-compatibility/2006" xmlns:aink="http://schemas.microsoft.com/office/drawing/2016/ink" xmlns:am3d="http://schemas.microsoft.com/office/drawing/2017/model3d" xmlns:o="urn:schemas-microsoft-com:office:office" xmlns:oel="http://schemas.microsoft.com/office/2019/extlst" xmlns:r="http://schemas.openxmlformats.org/officeDocument/2006/relationships" xmlns:m="http://schemas.openxmlformats.org/officeDocument/2006/math" xmlns:v="urn:schemas-microsoft-com:vml" xmlns:wp14="http://schemas.microsoft.com/office/word/2010/wordprocessingDrawing" xmlns:wp="http://schemas.openxmlformats.org/drawingml/2006/wordprocessingDrawing" xmlns:w10="urn:schemas-microsoft-com:office:word" xmlns:w="http://schemas.openxmlformats.org/wordprocessingml/2006/main" xmlns:w14="http://schemas.microsoft.com/office/word/2010/wordml" xmlns:w15="http://schemas.microsoft.com/office/word/2012/wordml" xmlns:w16cei="http://schemas.microsoft.com/office/word/2026/wordml/cei" xmlns:w16cex="http://schemas.microsoft.com/office/word/2018/wordml/cex" xmlns:w16cid="http://schemas.microsoft.com/office/word/2016/wordml/cid" xmlns:w16="http://schemas.microsoft.com/office/word/2018/wordml" xmlns:w16du="http://schemas.microsoft.com/office/word/2023/wordml/word16du" xmlns:w16sdtdh="http://schemas.microsoft.com/office/word/2020/wordml/sdtdatahash" xmlns:w16sdtfl="http://schemas.microsoft.com/office/word/2024/wordml/sdtformatlock" xmlns:w16se="http://schemas.microsoft.com/office/word/2015/wordml/symex" xmlns:wpg="http://schemas.microsoft.com/office/word/2010/wordprocessingGroup" xmlns:wpi="http://schemas.microsoft.com/office/word/2010/wordprocessingInk" xmlns:wne="http://schemas.microsoft.com/office/word/2006/wordml" xmlns:wps="http://schemas.microsoft.com/office/word/2010/wordprocessingShape" mc:Ignorable="w14 w15 w16se w16cid w16 w16cex w16sdtdh w16sdtfl w16du wp14">
   <w:endnote w:type="separator" w:id="-1">
     <w:p>
       <w:r>
@@ -1290,7 +1340,7 @@
 </file>
 
 <file path=word/footnotes.xml><?xml version="1.0" encoding="utf-8"?>
-<w:footnotes xmlns:wpc="http://schemas.microsoft.com/office/word/2010/wordprocessingCanvas" xmlns:cx="http://schemas.microsoft.com/office/drawing/2014/chartex" xmlns:cx1="http://schemas.microsoft.com/office/drawing/2015/9/8/chartex" xmlns:cx2="http://schemas.microsoft.com/office/drawing/2015/10/21/chartex" xmlns:cx3="http://schemas.microsoft.com/office/drawing/2016/5/9/chartex" xmlns:cx4="http://schemas.microsoft.com/office/drawing/2016/5/10/chartex" xmlns:cx5="http://schemas.microsoft.com/office/drawing/2016/5/11/chartex" xmlns:cx6="http://schemas.microsoft.com/office/drawing/2016/5/12/chartex" xmlns:cx7="http://schemas.microsoft.com/office/drawing/2016/5/13/chartex" xmlns:cx8="http://schemas.microsoft.com/office/drawing/2016/5/14/chartex" xmlns:mc="http://schemas.openxmlformats.org/markup-compatibility/2006" xmlns:aink="http://schemas.microsoft.com/office/drawing/2016/ink" xmlns:am3d="http://schemas.microsoft.com/office/drawing/2017/model3d" xmlns:o="urn:schemas-microsoft-com:office:office" xmlns:oel="http://schemas.microsoft.com/office/2019/extlst" xmlns:r="http://schemas.openxmlformats.org/officeDocument/2006/relationships" xmlns:m="http://schemas.openxmlformats.org/officeDocument/2006/math" xmlns:v="urn:schemas-microsoft-com:vml" xmlns:wp14="http://schemas.microsoft.com/office/word/2010/wordprocessingDrawing" xmlns:wp="http://schemas.openxmlformats.org/drawingml/2006/wordprocessingDrawing" xmlns:w10="urn:schemas-microsoft-com:office:word" xmlns:w="http://schemas.openxmlformats.org/wordprocessingml/2006/main" xmlns:w14="http://schemas.microsoft.com/office/word/2010/wordml" xmlns:w15="http://schemas.microsoft.com/office/word/2012/wordml" xmlns:w16cex="http://schemas.microsoft.com/office/word/2018/wordml/cex" xmlns:w16cid="http://schemas.microsoft.com/office/word/2016/wordml/cid" xmlns:w16="http://schemas.microsoft.com/office/word/2018/wordml" xmlns:w16du="http://schemas.microsoft.com/office/word/2023/wordml/word16du" xmlns:w16sdtdh="http://schemas.microsoft.com/office/word/2020/wordml/sdtdatahash" xmlns:w16sdtfl="http://schemas.microsoft.com/office/word/2024/wordml/sdtformatlock" xmlns:w16se="http://schemas.microsoft.com/office/word/2015/wordml/symex" xmlns:wpg="http://schemas.microsoft.com/office/word/2010/wordprocessingGroup" xmlns:wpi="http://schemas.microsoft.com/office/word/2010/wordprocessingInk" xmlns:wne="http://schemas.microsoft.com/office/word/2006/wordml" xmlns:wps="http://schemas.microsoft.com/office/word/2010/wordprocessingShape" mc:Ignorable="w14 w15 w16se w16cid w16 w16cex w16sdtdh w16sdtfl w16du wp14">
+<w:footnotes xmlns:wpc="http://schemas.microsoft.com/office/word/2010/wordprocessingCanvas" xmlns:cx="http://schemas.microsoft.com/office/drawing/2014/chartex" xmlns:cx1="http://schemas.microsoft.com/office/drawing/2015/9/8/chartex" xmlns:cx2="http://schemas.microsoft.com/office/drawing/2015/10/21/chartex" xmlns:cx3="http://schemas.microsoft.com/office/drawing/2016/5/9/chartex" xmlns:cx4="http://schemas.microsoft.com/office/drawing/2016/5/10/chartex" xmlns:cx5="http://schemas.microsoft.com/office/drawing/2016/5/11/chartex" xmlns:cx6="http://schemas.microsoft.com/office/drawing/2016/5/12/chartex" xmlns:cx7="http://schemas.microsoft.com/office/drawing/2016/5/13/chartex" xmlns:cx8="http://schemas.microsoft.com/office/drawing/2016/5/14/chartex" xmlns:mc="http://schemas.openxmlformats.org/markup-compatibility/2006" xmlns:aink="http://schemas.microsoft.com/office/drawing/2016/ink" xmlns:am3d="http://schemas.microsoft.com/office/drawing/2017/model3d" xmlns:o="urn:schemas-microsoft-com:office:office" xmlns:oel="http://schemas.microsoft.com/office/2019/extlst" xmlns:r="http://schemas.openxmlformats.org/officeDocument/2006/relationships" xmlns:m="http://schemas.openxmlformats.org/officeDocument/2006/math" xmlns:v="urn:schemas-microsoft-com:vml" xmlns:wp14="http://schemas.microsoft.com/office/word/2010/wordprocessingDrawing" xmlns:wp="http://schemas.openxmlformats.org/drawingml/2006/wordprocessingDrawing" xmlns:w10="urn:schemas-microsoft-com:office:word" xmlns:w="http://schemas.openxmlformats.org/wordprocessingml/2006/main" xmlns:w14="http://schemas.microsoft.com/office/word/2010/wordml" xmlns:w15="http://schemas.microsoft.com/office/word/2012/wordml" xmlns:w16cei="http://schemas.microsoft.com/office/word/2026/wordml/cei" xmlns:w16cex="http://schemas.microsoft.com/office/word/2018/wordml/cex" xmlns:w16cid="http://schemas.microsoft.com/office/word/2016/wordml/cid" xmlns:w16="http://schemas.microsoft.com/office/word/2018/wordml" xmlns:w16du="http://schemas.microsoft.com/office/word/2023/wordml/word16du" xmlns:w16sdtdh="http://schemas.microsoft.com/office/word/2020/wordml/sdtdatahash" xmlns:w16sdtfl="http://schemas.microsoft.com/office/word/2024/wordml/sdtformatlock" xmlns:w16se="http://schemas.microsoft.com/office/word/2015/wordml/symex" xmlns:wpg="http://schemas.microsoft.com/office/word/2010/wordprocessingGroup" xmlns:wpi="http://schemas.microsoft.com/office/word/2010/wordprocessingInk" xmlns:wne="http://schemas.microsoft.com/office/word/2006/wordml" xmlns:wps="http://schemas.microsoft.com/office/word/2010/wordprocessingShape" mc:Ignorable="w14 w15 w16se w16cid w16 w16cex w16sdtdh w16sdtfl w16du wp14">
   <w:footnote w:type="separator" w:id="-1">
     <w:p>
       <w:r>
@@ -1309,7 +1359,7 @@
 </file>
 
 <file path=word/numbering.xml><?xml version="1.0" encoding="utf-8"?>
-<w:numbering xmlns:wpc="http://schemas.microsoft.com/office/word/2010/wordprocessingCanvas" xmlns:cx="http://schemas.microsoft.com/office/drawing/2014/chartex" xmlns:cx1="http://schemas.microsoft.com/office/drawing/2015/9/8/chartex" xmlns:cx2="http://schemas.microsoft.com/office/drawing/2015/10/21/chartex" xmlns:cx3="http://schemas.microsoft.com/office/drawing/2016/5/9/chartex" xmlns:cx4="http://schemas.microsoft.com/office/drawing/2016/5/10/chartex" xmlns:cx5="http://schemas.microsoft.com/office/drawing/2016/5/11/chartex" xmlns:cx6="http://schemas.microsoft.com/office/drawing/2016/5/12/chartex" xmlns:cx7="http://schemas.microsoft.com/office/drawing/2016/5/13/chartex" xmlns:cx8="http://schemas.microsoft.com/office/drawing/2016/5/14/chartex" xmlns:mc="http://schemas.openxmlformats.org/markup-compatibility/2006" xmlns:aink="http://schemas.microsoft.com/office/drawing/2016/ink" xmlns:am3d="http://schemas.microsoft.com/office/drawing/2017/model3d" xmlns:o="urn:schemas-microsoft-com:office:office" xmlns:oel="http://schemas.microsoft.com/office/2019/extlst" xmlns:r="http://schemas.openxmlformats.org/officeDocument/2006/relationships" xmlns:m="http://schemas.openxmlformats.org/officeDocument/2006/math" xmlns:v="urn:schemas-microsoft-com:vml" xmlns:wp14="http://schemas.microsoft.com/office/word/2010/wordprocessingDrawing" xmlns:wp="http://schemas.openxmlformats.org/drawingml/2006/wordprocessingDrawing" xmlns:w10="urn:schemas-microsoft-com:office:word" xmlns:w="http://schemas.openxmlformats.org/wordprocessingml/2006/main" xmlns:w14="http://schemas.microsoft.com/office/word/2010/wordml" xmlns:w15="http://schemas.microsoft.com/office/word/2012/wordml" xmlns:w16cex="http://schemas.microsoft.com/office/word/2018/wordml/cex" xmlns:w16cid="http://schemas.microsoft.com/office/word/2016/wordml/cid" xmlns:w16="http://schemas.microsoft.com/office/word/2018/wordml" xmlns:w16du="http://schemas.microsoft.com/office/word/2023/wordml/word16du" xmlns:w16sdtdh="http://schemas.microsoft.com/office/word/2020/wordml/sdtdatahash" xmlns:w16sdtfl="http://schemas.microsoft.com/office/word/2024/wordml/sdtformatlock" xmlns:w16se="http://schemas.microsoft.com/office/word/2015/wordml/symex" xmlns:wpg="http://schemas.microsoft.com/office/word/2010/wordprocessingGroup" xmlns:wpi="http://schemas.microsoft.com/office/word/2010/wordprocessingInk" xmlns:wne="http://schemas.microsoft.com/office/word/2006/wordml" xmlns:wps="http://schemas.microsoft.com/office/word/2010/wordprocessingShape" mc:Ignorable="w14 w15 w16se w16cid w16 w16cex w16sdtdh w16sdtfl w16du wp14">
+<w:numbering xmlns:wpc="http://schemas.microsoft.com/office/word/2010/wordprocessingCanvas" xmlns:cx="http://schemas.microsoft.com/office/drawing/2014/chartex" xmlns:cx1="http://schemas.microsoft.com/office/drawing/2015/9/8/chartex" xmlns:cx2="http://schemas.microsoft.com/office/drawing/2015/10/21/chartex" xmlns:cx3="http://schemas.microsoft.com/office/drawing/2016/5/9/chartex" xmlns:cx4="http://schemas.microsoft.com/office/drawing/2016/5/10/chartex" xmlns:cx5="http://schemas.microsoft.com/office/drawing/2016/5/11/chartex" xmlns:cx6="http://schemas.microsoft.com/office/drawing/2016/5/12/chartex" xmlns:cx7="http://schemas.microsoft.com/office/drawing/2016/5/13/chartex" xmlns:cx8="http://schemas.microsoft.com/office/drawing/2016/5/14/chartex" xmlns:mc="http://schemas.openxmlformats.org/markup-compatibility/2006" xmlns:aink="http://schemas.microsoft.com/office/drawing/2016/ink" xmlns:am3d="http://schemas.microsoft.com/office/drawing/2017/model3d" xmlns:o="urn:schemas-microsoft-com:office:office" xmlns:oel="http://schemas.microsoft.com/office/2019/extlst" xmlns:r="http://schemas.openxmlformats.org/officeDocument/2006/relationships" xmlns:m="http://schemas.openxmlformats.org/officeDocument/2006/math" xmlns:v="urn:schemas-microsoft-com:vml" xmlns:wp14="http://schemas.microsoft.com/office/word/2010/wordprocessingDrawing" xmlns:wp="http://schemas.openxmlformats.org/drawingml/2006/wordprocessingDrawing" xmlns:w10="urn:schemas-microsoft-com:office:word" xmlns:w="http://schemas.openxmlformats.org/wordprocessingml/2006/main" xmlns:w14="http://schemas.microsoft.com/office/word/2010/wordml" xmlns:w15="http://schemas.microsoft.com/office/word/2012/wordml" xmlns:w16cei="http://schemas.microsoft.com/office/word/2026/wordml/cei" xmlns:w16cex="http://schemas.microsoft.com/office/word/2018/wordml/cex" xmlns:w16cid="http://schemas.microsoft.com/office/word/2016/wordml/cid" xmlns:w16="http://schemas.microsoft.com/office/word/2018/wordml" xmlns:w16du="http://schemas.microsoft.com/office/word/2023/wordml/word16du" xmlns:w16sdtdh="http://schemas.microsoft.com/office/word/2020/wordml/sdtdatahash" xmlns:w16sdtfl="http://schemas.microsoft.com/office/word/2024/wordml/sdtformatlock" xmlns:w16se="http://schemas.microsoft.com/office/word/2015/wordml/symex" xmlns:wpg="http://schemas.microsoft.com/office/word/2010/wordprocessingGroup" xmlns:wpi="http://schemas.microsoft.com/office/word/2010/wordprocessingInk" xmlns:wne="http://schemas.microsoft.com/office/word/2006/wordml" xmlns:wps="http://schemas.microsoft.com/office/word/2010/wordprocessingShape" mc:Ignorable="w14 w15 w16se w16cid w16 w16cex w16sdtdh w16sdtfl w16du wp14">
   <w:abstractNum w:abstractNumId="0" w15:restartNumberingAfterBreak="0">
     <w:nsid w:val="197A022B"/>
     <w:multiLevelType w:val="hybridMultilevel"/>

</xml_diff>